<commit_message>
Actualizo reporte (docx y pdf)
</commit_message>
<xml_diff>
--- a/docs/ReporteUnidad4.docx
+++ b/docs/ReporteUnidad4.docx
@@ -191,16 +191,7 @@
           </w:p>
           <w:p>
             <w:r>
-              <w:t>28</w:t>
-            </w:r>
-            <w:r>
-              <w:t>/</w:t>
-            </w:r>
-            <w:r>
-              <w:t>10</w:t>
-            </w:r>
-            <w:r>
-              <w:t>/2026</w:t>
+              <w:t>28/10/2026</w:t>
             </w:r>
           </w:p>
         </w:tc>
@@ -3691,14 +3682,68 @@
     </w:p>
     <w:p>
       <w:pPr>
+        <w:spacing w:after="160" w:line="278" w:lineRule="auto"/>
+        <w:jc w:val="left"/>
+        <w:rPr>
+          <w:lang w:val="es-ES"/>
+        </w:rPr>
+      </w:pPr>
+      <w:r>
+        <w:rPr>
+          <w:lang w:val="es-ES"/>
+        </w:rPr>
+        <w:br w:type="page"/>
+      </w:r>
+    </w:p>
+    <w:p>
+      <w:pPr>
+        <w:pStyle w:val="Heading1"/>
+        <w:rPr>
+          <w:lang w:val="es-ES"/>
+        </w:rPr>
+      </w:pPr>
+      <w:r>
+        <w:rPr>
+          <w:lang w:val="es-ES"/>
+        </w:rPr>
+        <w:lastRenderedPageBreak/>
+        <w:t xml:space="preserve">Repositorio </w:t>
+      </w:r>
+      <w:proofErr w:type="spellStart"/>
+      <w:r>
+        <w:rPr>
+          <w:lang w:val="es-ES"/>
+        </w:rPr>
+        <w:t>Github</w:t>
+      </w:r>
+      <w:proofErr w:type="spellEnd"/>
+    </w:p>
+    <w:p>
+      <w:pPr>
+        <w:rPr>
+          <w:lang w:val="es-ES"/>
+        </w:rPr>
+      </w:pPr>
+      <w:hyperlink r:id="rId17" w:history="1">
+        <w:r>
+          <w:rPr>
+            <w:rStyle w:val="Hyperlink"/>
+            <w:lang w:val="es-ES"/>
+          </w:rPr>
+          <w:t>https://github.com/yahirvela19/Unidad4</w:t>
+        </w:r>
+      </w:hyperlink>
+    </w:p>
+    <w:p>
+      <w:pPr>
         <w:rPr>
           <w:lang w:val="es-ES"/>
         </w:rPr>
       </w:pPr>
     </w:p>
     <w:sectPr>
-      <w:footerReference w:type="even" r:id="rId17"/>
-      <w:footerReference w:type="default" r:id="rId18"/>
+      <w:footerReference w:type="even" r:id="rId18"/>
+      <w:footerReference w:type="default" r:id="rId19"/>
       <w:pgSz w:w="12240" w:h="15840"/>
       <w:pgMar w:top="1440" w:right="1440" w:bottom="1440" w:left="1440" w:header="708" w:footer="708" w:gutter="0"/>
       <w:cols w:space="708"/>
@@ -5467,6 +5512,18 @@
       </w:tblBorders>
     </w:tblPr>
   </w:style>
+  <w:style w:type="character" w:styleId="UnresolvedMention">
+    <w:name w:val="Unresolved Mention"/>
+    <w:basedOn w:val="DefaultParagraphFont"/>
+    <w:uiPriority w:val="99"/>
+    <w:semiHidden/>
+    <w:unhideWhenUsed/>
+    <w:rsid w:val="005209A0"/>
+    <w:rPr>
+      <w:color w:val="605E5C"/>
+      <w:shd w:val="clear" w:color="auto" w:fill="E1DFDD"/>
+    </w:rPr>
+  </w:style>
 </w:styles>
 </file>
 

</xml_diff>